<commit_message>
update formuls and readme
</commit_message>
<xml_diff>
--- a/examples/example.docx
+++ b/examples/example.docx
@@ -626,7 +626,7 @@
           <w:sz w:val="28"/>
           <w:szCs w:val="28"/>
         </w:rPr>
-        <w:t xml:space="preserve">2026</w:t>
+        <w:t xml:space="preserve">2027</w:t>
       </w:r>
     </w:p>
     <w:p>
@@ -1033,6 +1033,47 @@
           <w:sz w:val="28"/>
         </w:rPr>
         <w:t>Структура базы данных приведена на рисунке 1.</w:t>
+      </w:r>
+    </w:p>
+    <w:p>
+      <w:pPr>
+        <w:spacing w:line="240" w:lineRule="auto" w:before="120"/>
+        <w:ind w:firstLine="0"/>
+        <w:jc w:val="center"/>
+      </w:pPr>
+      <w:r>
+        <w:drawing>
+          <wp:inline xmlns:a="http://schemas.openxmlformats.org/drawingml/2006/main" xmlns:pic="http://schemas.openxmlformats.org/drawingml/2006/picture">
+            <wp:extent cx="5760000" cy="3030296"/>
+            <wp:docPr id="1" name="Picture 1"/>
+            <wp:cNvGraphicFramePr>
+              <a:graphicFrameLocks noChangeAspect="1"/>
+            </wp:cNvGraphicFramePr>
+            <a:graphic>
+              <a:graphicData uri="http://schemas.openxmlformats.org/drawingml/2006/picture">
+                <pic:pic>
+                  <pic:nvPicPr>
+                    <pic:cNvPr id="0" name="structure.png"/>
+                    <pic:cNvPicPr/>
+                  </pic:nvPicPr>
+                  <pic:blipFill>
+                    <a:blip r:embed="rId13"/>
+                    <a:stretch>
+                      <a:fillRect/>
+                    </a:stretch>
+                  </pic:blipFill>
+                  <pic:spPr>
+                    <a:xfrm>
+                      <a:off x="0" y="0"/>
+                      <a:ext cx="5760000" cy="3030296"/>
+                    </a:xfrm>
+                    <a:prstGeom prst="rect"/>
+                  </pic:spPr>
+                </pic:pic>
+              </a:graphicData>
+            </a:graphic>
+          </wp:inline>
+        </w:drawing>
       </w:r>
     </w:p>
     <w:p>
@@ -1667,12 +1708,131 @@
         <w:ind w:firstLine="0"/>
         <w:jc w:val="center"/>
       </w:pPr>
-      <w:r>
-        <w:rPr>
-          <w:rFonts w:ascii="Times New Roman" w:hAnsi="Times New Roman" w:cs="Times New Roman" w:eastAsia="Times New Roman"/>
-          <w:sz w:val="28"/>
-        </w:rPr>
-        <w:t>\bar{t} = (1/n) * sum(t</w:t>
+      <m:oMath>
+        <m:box>
+          <m:e>
+            <m:acc>
+              <m:accPr>
+                <m:chr m:val="¯"/>
+              </m:accPr>
+              <m:e>
+                <m:box>
+                  <m:e>
+                    <m:r>
+                      <m:rPr>
+                        <m:sty m:val="i"/>
+                      </m:rPr>
+                      <m:t>t</m:t>
+                    </m:r>
+                  </m:e>
+                </m:box>
+              </m:e>
+            </m:acc>
+            <m:r>
+              <m:rPr>
+                <m:sty m:val="p"/>
+              </m:rPr>
+              <m:t>=</m:t>
+            </m:r>
+            <m:r>
+              <m:rPr>
+                <m:sty m:val="p"/>
+              </m:rPr>
+              <m:t>(</m:t>
+            </m:r>
+            <m:r>
+              <m:rPr>
+                <m:sty m:val="p"/>
+              </m:rPr>
+              <m:t>1</m:t>
+            </m:r>
+            <m:r>
+              <m:rPr>
+                <m:sty m:val="p"/>
+              </m:rPr>
+              <m:t>/</m:t>
+            </m:r>
+            <m:r>
+              <m:rPr>
+                <m:sty m:val="i"/>
+              </m:rPr>
+              <m:t>n</m:t>
+            </m:r>
+            <m:r>
+              <m:rPr>
+                <m:sty m:val="p"/>
+              </m:rPr>
+              <m:t>)</m:t>
+            </m:r>
+            <m:r>
+              <m:rPr>
+                <m:sty m:val="p"/>
+              </m:rPr>
+              <m:t>*</m:t>
+            </m:r>
+            <m:r>
+              <m:rPr>
+                <m:sty m:val="i"/>
+              </m:rPr>
+              <m:t>s</m:t>
+            </m:r>
+            <m:r>
+              <m:rPr>
+                <m:sty m:val="i"/>
+              </m:rPr>
+              <m:t>u</m:t>
+            </m:r>
+            <m:r>
+              <m:rPr>
+                <m:sty m:val="i"/>
+              </m:rPr>
+              <m:t>m</m:t>
+            </m:r>
+            <m:r>
+              <m:rPr>
+                <m:sty m:val="p"/>
+              </m:rPr>
+              <m:t>(</m:t>
+            </m:r>
+            <m:sSub>
+              <m:e>
+                <m:r>
+                  <m:rPr>
+                    <m:sty m:val="i"/>
+                  </m:rPr>
+                  <m:t>t</m:t>
+                </m:r>
+              </m:e>
+              <m:sub>
+                <m:box>
+                  <m:e>
+                    <m:r>
+                      <m:rPr>
+                        <m:sty m:val="i"/>
+                      </m:rPr>
+                      <m:t>i</m:t>
+                    </m:r>
+                  </m:e>
+                </m:box>
+              </m:sub>
+            </m:sSub>
+            <m:r>
+              <m:rPr>
+                <m:sty m:val="p"/>
+              </m:rPr>
+              <m:t>)</m:t>
+            </m:r>
+          </m:e>
+        </m:box>
+      </m:oMath>
+    </w:p>
+    <w:p>
+      <w:r>
+        <w:rPr>
+          <w:rFonts w:ascii="Times New Roman" w:hAnsi="Times New Roman" w:cs="Times New Roman" w:eastAsia="Times New Roman"/>
+          <w:sz w:val="28"/>
+        </w:rPr>
+        <w:t>Здесь t</w:t>
       </w:r>
       <w:r>
         <w:rPr>
@@ -1687,30 +1847,6 @@
           <w:rFonts w:ascii="Times New Roman" w:hAnsi="Times New Roman" w:cs="Times New Roman" w:eastAsia="Times New Roman"/>
           <w:sz w:val="28"/>
         </w:rPr>
-        <w:t>)</w:t>
-      </w:r>
-    </w:p>
-    <w:p>
-      <w:r>
-        <w:rPr>
-          <w:rFonts w:ascii="Times New Roman" w:hAnsi="Times New Roman" w:cs="Times New Roman" w:eastAsia="Times New Roman"/>
-          <w:sz w:val="28"/>
-        </w:rPr>
-        <w:t>Здесь t</w:t>
-      </w:r>
-      <w:r>
-        <w:rPr>
-          <w:rFonts w:ascii="Times New Roman" w:hAnsi="Times New Roman" w:cs="Times New Roman" w:eastAsia="Times New Roman"/>
-          <w:sz w:val="28"/>
-          <w:vertAlign w:val="subscript"/>
-        </w:rPr>
-        <w:t>i</w:t>
-      </w:r>
-      <w:r>
-        <w:rPr>
-          <w:rFonts w:ascii="Times New Roman" w:hAnsi="Times New Roman" w:cs="Times New Roman" w:eastAsia="Times New Roman"/>
-          <w:sz w:val="28"/>
-        </w:rPr>
         <w:t xml:space="preserve"> – время выполнения i-го запроса, n – количество замеров.</w:t>
       </w:r>
     </w:p>
@@ -1788,7 +1924,7 @@
       <w:r>
         <w:br/>
       </w:r>
-      <w:hyperlink r:id="rId13">
+      <w:hyperlink r:id="rId14">
         <w:r>
           <w:rPr>
             <w:rFonts w:ascii="Times New Roman" w:hAnsi="Times New Roman" w:cs="Times New Roman"/>

</xml_diff>